<commit_message>
chero update's from figures around
</commit_message>
<xml_diff>
--- a/2026/outputs/monitoring_method_overview.docx
+++ b/2026/outputs/monitoring_method_overview.docx
@@ -52,11 +52,7 @@
         <w:pStyle w:val="centered"/>
       </w:pPr>
       <w:r>
-        <w:t xml:space="preserve">Total monitored (observed) days at sea reported in the WGBYC database and in the data filtered to compute BEAM estimatess per monitoring method (2017-2025) at-sea-observers,
-electronic monitoring, port observers, and vessel crew observers, logbooks, other. The BEAM 
-filtered for use in ToR C (see specific section, BEAM): at-sea-observ-
-ers, electronic monitoring, vessel crew observers except for Estonia, and
-other only for Norway.</w:t>
+        <w:t xml:space="preserve">Total monitored (observed) days at sea reported in the WGBYC database and in the data filtered to compute BEAM estimatess per monitoring method (2017-2025) at-sea-observers, electronic monitoring, port observers, and vessel crew observers, logbooks, other. The BEAM filtered for use in ToR C (see specific section, BEAM): at-sea-observers, electronic monitoring, vessel crew observers except for Estonia, and other only for Norway.</w:t>
       </w:r>
     </w:p>
     <w:sectPr>

</xml_diff>